<commit_message>
Ready for release of 5.0.0.0
</commit_message>
<xml_diff>
--- a/Documentation/Generering af release 5.0.0.0.docx
+++ b/Documentation/Generering af release 5.0.0.0.docx
@@ -1324,15 +1324,15 @@
         </w:tblCellMar>
       </w:tblPr>
       <w:tblGrid>
-        <w:gridCol w:w="1001"/>
+        <w:gridCol w:w="1000"/>
         <w:gridCol w:w="1813"/>
-        <w:gridCol w:w="6486"/>
+        <w:gridCol w:w="6487"/>
       </w:tblGrid>
       <w:tr>
         <w:trPr/>
         <w:tc>
           <w:tcPr>
-            <w:tcW w:w="1001" w:type="dxa"/>
+            <w:tcW w:w="1000" w:type="dxa"/>
             <w:tcBorders>
               <w:top w:val="single" w:sz="4" w:space="0" w:color="000000"/>
               <w:left w:val="single" w:sz="4" w:space="0" w:color="000000"/>
@@ -1392,7 +1392,7 @@
         </w:tc>
         <w:tc>
           <w:tcPr>
-            <w:tcW w:w="6486" w:type="dxa"/>
+            <w:tcW w:w="6487" w:type="dxa"/>
             <w:tcBorders>
               <w:top w:val="single" w:sz="4" w:space="0" w:color="000000"/>
               <w:left w:val="single" w:sz="4" w:space="0" w:color="000000"/>
@@ -1426,7 +1426,7 @@
         <w:trPr/>
         <w:tc>
           <w:tcPr>
-            <w:tcW w:w="1001" w:type="dxa"/>
+            <w:tcW w:w="1000" w:type="dxa"/>
             <w:tcBorders>
               <w:top w:val="single" w:sz="4" w:space="0" w:color="000000"/>
               <w:left w:val="single" w:sz="4" w:space="0" w:color="000000"/>
@@ -1486,7 +1486,7 @@
         </w:tc>
         <w:tc>
           <w:tcPr>
-            <w:tcW w:w="6486" w:type="dxa"/>
+            <w:tcW w:w="6487" w:type="dxa"/>
             <w:tcBorders>
               <w:top w:val="single" w:sz="4" w:space="0" w:color="000000"/>
               <w:left w:val="single" w:sz="4" w:space="0" w:color="000000"/>
@@ -1517,7 +1517,7 @@
         <w:trPr/>
         <w:tc>
           <w:tcPr>
-            <w:tcW w:w="1001" w:type="dxa"/>
+            <w:tcW w:w="1000" w:type="dxa"/>
             <w:tcBorders>
               <w:top w:val="single" w:sz="4" w:space="0" w:color="000000"/>
               <w:left w:val="single" w:sz="4" w:space="0" w:color="000000"/>
@@ -1574,7 +1574,7 @@
         </w:tc>
         <w:tc>
           <w:tcPr>
-            <w:tcW w:w="6486" w:type="dxa"/>
+            <w:tcW w:w="6487" w:type="dxa"/>
             <w:tcBorders>
               <w:top w:val="single" w:sz="4" w:space="0" w:color="000000"/>
               <w:left w:val="single" w:sz="4" w:space="0" w:color="000000"/>
@@ -1605,7 +1605,7 @@
         <w:trPr/>
         <w:tc>
           <w:tcPr>
-            <w:tcW w:w="1001" w:type="dxa"/>
+            <w:tcW w:w="1000" w:type="dxa"/>
             <w:tcBorders>
               <w:left w:val="single" w:sz="4" w:space="0" w:color="000000"/>
               <w:bottom w:val="single" w:sz="4" w:space="0" w:color="000000"/>
@@ -1659,7 +1659,7 @@
         </w:tc>
         <w:tc>
           <w:tcPr>
-            <w:tcW w:w="6486" w:type="dxa"/>
+            <w:tcW w:w="6487" w:type="dxa"/>
             <w:tcBorders>
               <w:left w:val="single" w:sz="4" w:space="0" w:color="000000"/>
               <w:bottom w:val="single" w:sz="4" w:space="0" w:color="000000"/>
@@ -2201,93 +2201,37 @@
             <w:pPr>
               <w:pStyle w:val="Normal"/>
               <w:jc w:val="left"/>
-              <w:rPr>
-                <w:rFonts w:ascii="Liberation Serif" w:hAnsi="Liberation Serif"/>
-                <w:b w:val="false"/>
-                <w:b w:val="false"/>
-                <w:bCs w:val="false"/>
-                <w:i w:val="false"/>
-                <w:i w:val="false"/>
-                <w:iCs w:val="false"/>
-                <w:strike w:val="false"/>
-                <w:dstrike w:val="false"/>
-                <w:outline w:val="false"/>
-                <w:shadow w:val="false"/>
-                <w:color w:val="000000"/>
-                <w:sz w:val="24"/>
-                <w:szCs w:val="24"/>
-                <w:u w:val="none"/>
-              </w:rPr>
+              <w:rPr/>
             </w:pPr>
             <w:r>
               <w:rPr>
                 <w:rFonts w:ascii="Consolas" w:hAnsi="Consolas"/>
-                <w:b w:val="false"/>
-                <w:bCs w:val="false"/>
-                <w:i w:val="false"/>
-                <w:iCs w:val="false"/>
-                <w:strike w:val="false"/>
-                <w:dstrike w:val="false"/>
-                <w:outline w:val="false"/>
-                <w:shadow w:val="false"/>
                 <w:color w:val="0000FF"/>
                 <w:sz w:val="19"/>
-                <w:szCs w:val="24"/>
-                <w:u w:val="none"/>
               </w:rPr>
               <w:t xml:space="preserve">    </w:t>
             </w:r>
             <w:r>
               <w:rPr>
                 <w:rFonts w:ascii="Consolas" w:hAnsi="Consolas"/>
-                <w:b w:val="false"/>
-                <w:bCs w:val="false"/>
-                <w:i w:val="false"/>
-                <w:iCs w:val="false"/>
-                <w:strike w:val="false"/>
-                <w:dstrike w:val="false"/>
-                <w:outline w:val="false"/>
-                <w:shadow w:val="false"/>
                 <w:color w:val="0000FF"/>
                 <w:sz w:val="19"/>
-                <w:szCs w:val="24"/>
-                <w:u w:val="none"/>
               </w:rPr>
               <w:t>&lt;</w:t>
             </w:r>
             <w:r>
               <w:rPr>
                 <w:rFonts w:ascii="Consolas" w:hAnsi="Consolas"/>
-                <w:b w:val="false"/>
-                <w:bCs w:val="false"/>
-                <w:i w:val="false"/>
-                <w:iCs w:val="false"/>
-                <w:strike w:val="false"/>
-                <w:dstrike w:val="false"/>
-                <w:outline w:val="false"/>
-                <w:shadow w:val="false"/>
                 <w:color w:val="A31515"/>
                 <w:sz w:val="19"/>
-                <w:szCs w:val="24"/>
-                <w:u w:val="none"/>
               </w:rPr>
               <w:t>appSettings</w:t>
             </w:r>
             <w:r>
               <w:rPr>
                 <w:rFonts w:ascii="Consolas" w:hAnsi="Consolas"/>
-                <w:b w:val="false"/>
-                <w:bCs w:val="false"/>
-                <w:i w:val="false"/>
-                <w:iCs w:val="false"/>
-                <w:strike w:val="false"/>
-                <w:dstrike w:val="false"/>
-                <w:outline w:val="false"/>
-                <w:shadow w:val="false"/>
                 <w:color w:val="0000FF"/>
                 <w:sz w:val="19"/>
-                <w:szCs w:val="24"/>
-                <w:u w:val="none"/>
               </w:rPr>
               <w:t>&gt;</w:t>
             </w:r>
@@ -2425,15 +2369,15 @@
                 <w:color w:val="0000FF"/>
                 <w:sz w:val="19"/>
               </w:rPr>
-              <w:t>&lt;</w:t>
-            </w:r>
-            <w:r>
-              <w:rPr>
-                <w:rFonts w:ascii="Consolas" w:hAnsi="Consolas"/>
-                <w:color w:val="A31515"/>
-                <w:sz w:val="19"/>
-              </w:rPr>
-              <w:t>add</w:t>
+              <w:t>&lt;!--</w:t>
+            </w:r>
+            <w:r>
+              <w:rPr>
+                <w:rFonts w:ascii="Consolas" w:hAnsi="Consolas"/>
+                <w:color w:val="008000"/>
+                <w:sz w:val="19"/>
+              </w:rPr>
+              <w:t xml:space="preserve"> &lt;add key="DeveloperCulture" value="ru-RU" /&gt; </w:t>
             </w:r>
             <w:r>
               <w:rPr>
@@ -2441,103 +2385,7 @@
                 <w:color w:val="0000FF"/>
                 <w:sz w:val="19"/>
               </w:rPr>
-              <w:t xml:space="preserve"> </w:t>
-            </w:r>
-            <w:r>
-              <w:rPr>
-                <w:rFonts w:ascii="Consolas" w:hAnsi="Consolas"/>
-                <w:color w:val="FF0000"/>
-                <w:sz w:val="19"/>
-              </w:rPr>
-              <w:t>key</w:t>
-            </w:r>
-            <w:r>
-              <w:rPr>
-                <w:rFonts w:ascii="Consolas" w:hAnsi="Consolas"/>
-                <w:color w:val="0000FF"/>
-                <w:sz w:val="19"/>
-              </w:rPr>
-              <w:t>=</w:t>
-            </w:r>
-            <w:r>
-              <w:rPr>
-                <w:rFonts w:ascii="Consolas" w:hAnsi="Consolas"/>
-                <w:color w:val="000000"/>
-                <w:sz w:val="19"/>
-              </w:rPr>
-              <w:t>"</w:t>
-            </w:r>
-            <w:r>
-              <w:rPr>
-                <w:rFonts w:ascii="Consolas" w:hAnsi="Consolas"/>
-                <w:color w:val="0000FF"/>
-                <w:sz w:val="19"/>
-              </w:rPr>
-              <w:t>DeveloperMode</w:t>
-            </w:r>
-            <w:r>
-              <w:rPr>
-                <w:rFonts w:ascii="Consolas" w:hAnsi="Consolas"/>
-                <w:color w:val="000000"/>
-                <w:sz w:val="19"/>
-              </w:rPr>
-              <w:t>"</w:t>
-            </w:r>
-            <w:r>
-              <w:rPr>
-                <w:rFonts w:ascii="Consolas" w:hAnsi="Consolas"/>
-                <w:color w:val="0000FF"/>
-                <w:sz w:val="19"/>
-              </w:rPr>
-              <w:t xml:space="preserve"> </w:t>
-            </w:r>
-            <w:r>
-              <w:rPr>
-                <w:rFonts w:ascii="Consolas" w:hAnsi="Consolas"/>
-                <w:color w:val="FF0000"/>
-                <w:sz w:val="19"/>
-              </w:rPr>
-              <w:t>value</w:t>
-            </w:r>
-            <w:r>
-              <w:rPr>
-                <w:rFonts w:ascii="Consolas" w:hAnsi="Consolas"/>
-                <w:color w:val="0000FF"/>
-                <w:sz w:val="19"/>
-              </w:rPr>
-              <w:t>=</w:t>
-            </w:r>
-            <w:r>
-              <w:rPr>
-                <w:rFonts w:ascii="Consolas" w:hAnsi="Consolas"/>
-                <w:color w:val="000000"/>
-                <w:sz w:val="19"/>
-              </w:rPr>
-              <w:t>"</w:t>
-            </w:r>
-            <w:r>
-              <w:rPr>
-                <w:rFonts w:ascii="Consolas" w:hAnsi="Consolas"/>
-                <w:color w:val="0000FF"/>
-                <w:sz w:val="19"/>
-              </w:rPr>
-              <w:t>no</w:t>
-            </w:r>
-            <w:r>
-              <w:rPr>
-                <w:rFonts w:ascii="Consolas" w:hAnsi="Consolas"/>
-                <w:color w:val="000000"/>
-                <w:sz w:val="19"/>
-              </w:rPr>
-              <w:t>"</w:t>
-            </w:r>
-            <w:r>
-              <w:rPr>
-                <w:rFonts w:ascii="Consolas" w:hAnsi="Consolas"/>
-                <w:color w:val="0000FF"/>
-                <w:sz w:val="19"/>
-              </w:rPr>
-              <w:t xml:space="preserve"> /&gt;</w:t>
+              <w:t xml:space="preserve">--&gt;     </w:t>
             </w:r>
           </w:p>
           <w:p>
@@ -2607,7 +2455,7 @@
                 <w:color w:val="0000FF"/>
                 <w:sz w:val="19"/>
               </w:rPr>
-              <w:t>ExperimentalCode</w:t>
+              <w:t>DeveloperMode</w:t>
             </w:r>
             <w:r>
               <w:rPr>
@@ -2741,6 +2589,274 @@
                 <w:color w:val="0000FF"/>
                 <w:sz w:val="19"/>
               </w:rPr>
+              <w:t>ExportToMusicXml</w:t>
+            </w:r>
+            <w:r>
+              <w:rPr>
+                <w:rFonts w:ascii="Consolas" w:hAnsi="Consolas"/>
+                <w:color w:val="000000"/>
+                <w:sz w:val="19"/>
+              </w:rPr>
+              <w:t>"</w:t>
+            </w:r>
+            <w:r>
+              <w:rPr>
+                <w:rFonts w:ascii="Consolas" w:hAnsi="Consolas"/>
+                <w:color w:val="0000FF"/>
+                <w:sz w:val="19"/>
+              </w:rPr>
+              <w:t xml:space="preserve"> </w:t>
+            </w:r>
+            <w:r>
+              <w:rPr>
+                <w:rFonts w:ascii="Consolas" w:hAnsi="Consolas"/>
+                <w:color w:val="FF0000"/>
+                <w:sz w:val="19"/>
+              </w:rPr>
+              <w:t>value</w:t>
+            </w:r>
+            <w:r>
+              <w:rPr>
+                <w:rFonts w:ascii="Consolas" w:hAnsi="Consolas"/>
+                <w:color w:val="0000FF"/>
+                <w:sz w:val="19"/>
+              </w:rPr>
+              <w:t>=</w:t>
+            </w:r>
+            <w:r>
+              <w:rPr>
+                <w:rFonts w:ascii="Consolas" w:hAnsi="Consolas"/>
+                <w:color w:val="000000"/>
+                <w:sz w:val="19"/>
+              </w:rPr>
+              <w:t>"</w:t>
+            </w:r>
+            <w:r>
+              <w:rPr>
+                <w:rFonts w:ascii="Consolas" w:hAnsi="Consolas"/>
+                <w:color w:val="0000FF"/>
+                <w:sz w:val="19"/>
+              </w:rPr>
+              <w:t>yes</w:t>
+            </w:r>
+            <w:r>
+              <w:rPr>
+                <w:rFonts w:ascii="Consolas" w:hAnsi="Consolas"/>
+                <w:color w:val="000000"/>
+                <w:sz w:val="19"/>
+              </w:rPr>
+              <w:t>"</w:t>
+            </w:r>
+            <w:r>
+              <w:rPr>
+                <w:rFonts w:ascii="Consolas" w:hAnsi="Consolas"/>
+                <w:color w:val="0000FF"/>
+                <w:sz w:val="19"/>
+              </w:rPr>
+              <w:t xml:space="preserve"> /&gt;</w:t>
+            </w:r>
+          </w:p>
+          <w:p>
+            <w:pPr>
+              <w:pStyle w:val="Normal"/>
+              <w:rPr/>
+            </w:pPr>
+            <w:r>
+              <w:rPr>
+                <w:rFonts w:ascii="Consolas" w:hAnsi="Consolas"/>
+                <w:color w:val="0000FF"/>
+                <w:sz w:val="19"/>
+              </w:rPr>
+              <w:t xml:space="preserve">      </w:t>
+            </w:r>
+            <w:r>
+              <w:rPr>
+                <w:rFonts w:ascii="Consolas" w:hAnsi="Consolas"/>
+                <w:color w:val="0000FF"/>
+                <w:sz w:val="19"/>
+              </w:rPr>
+              <w:t>&lt;</w:t>
+            </w:r>
+            <w:r>
+              <w:rPr>
+                <w:rFonts w:ascii="Consolas" w:hAnsi="Consolas"/>
+                <w:color w:val="A31515"/>
+                <w:sz w:val="19"/>
+              </w:rPr>
+              <w:t>add</w:t>
+            </w:r>
+            <w:r>
+              <w:rPr>
+                <w:rFonts w:ascii="Consolas" w:hAnsi="Consolas"/>
+                <w:color w:val="0000FF"/>
+                <w:sz w:val="19"/>
+              </w:rPr>
+              <w:t xml:space="preserve"> </w:t>
+            </w:r>
+            <w:r>
+              <w:rPr>
+                <w:rFonts w:ascii="Consolas" w:hAnsi="Consolas"/>
+                <w:color w:val="FF0000"/>
+                <w:sz w:val="19"/>
+              </w:rPr>
+              <w:t>key</w:t>
+            </w:r>
+            <w:r>
+              <w:rPr>
+                <w:rFonts w:ascii="Consolas" w:hAnsi="Consolas"/>
+                <w:color w:val="0000FF"/>
+                <w:sz w:val="19"/>
+              </w:rPr>
+              <w:t>=</w:t>
+            </w:r>
+            <w:r>
+              <w:rPr>
+                <w:rFonts w:ascii="Consolas" w:hAnsi="Consolas"/>
+                <w:color w:val="000000"/>
+                <w:sz w:val="19"/>
+              </w:rPr>
+              <w:t>"</w:t>
+            </w:r>
+            <w:r>
+              <w:rPr>
+                <w:rFonts w:ascii="Consolas" w:hAnsi="Consolas"/>
+                <w:color w:val="0000FF"/>
+                <w:sz w:val="19"/>
+              </w:rPr>
+              <w:t>ExperimentalCode</w:t>
+            </w:r>
+            <w:r>
+              <w:rPr>
+                <w:rFonts w:ascii="Consolas" w:hAnsi="Consolas"/>
+                <w:color w:val="000000"/>
+                <w:sz w:val="19"/>
+              </w:rPr>
+              <w:t>"</w:t>
+            </w:r>
+            <w:r>
+              <w:rPr>
+                <w:rFonts w:ascii="Consolas" w:hAnsi="Consolas"/>
+                <w:color w:val="0000FF"/>
+                <w:sz w:val="19"/>
+              </w:rPr>
+              <w:t xml:space="preserve"> </w:t>
+            </w:r>
+            <w:r>
+              <w:rPr>
+                <w:rFonts w:ascii="Consolas" w:hAnsi="Consolas"/>
+                <w:color w:val="FF0000"/>
+                <w:sz w:val="19"/>
+              </w:rPr>
+              <w:t>value</w:t>
+            </w:r>
+            <w:r>
+              <w:rPr>
+                <w:rFonts w:ascii="Consolas" w:hAnsi="Consolas"/>
+                <w:color w:val="0000FF"/>
+                <w:sz w:val="19"/>
+              </w:rPr>
+              <w:t>=</w:t>
+            </w:r>
+            <w:r>
+              <w:rPr>
+                <w:rFonts w:ascii="Consolas" w:hAnsi="Consolas"/>
+                <w:color w:val="000000"/>
+                <w:sz w:val="19"/>
+              </w:rPr>
+              <w:t>"</w:t>
+            </w:r>
+            <w:r>
+              <w:rPr>
+                <w:rFonts w:ascii="Consolas" w:hAnsi="Consolas"/>
+                <w:color w:val="0000FF"/>
+                <w:sz w:val="19"/>
+              </w:rPr>
+              <w:t>yes</w:t>
+            </w:r>
+            <w:r>
+              <w:rPr>
+                <w:rFonts w:ascii="Consolas" w:hAnsi="Consolas"/>
+                <w:color w:val="000000"/>
+                <w:sz w:val="19"/>
+              </w:rPr>
+              <w:t>"</w:t>
+            </w:r>
+            <w:r>
+              <w:rPr>
+                <w:rFonts w:ascii="Consolas" w:hAnsi="Consolas"/>
+                <w:color w:val="0000FF"/>
+                <w:sz w:val="19"/>
+              </w:rPr>
+              <w:t xml:space="preserve"> /&gt;</w:t>
+            </w:r>
+          </w:p>
+          <w:p>
+            <w:pPr>
+              <w:pStyle w:val="Normal"/>
+              <w:rPr/>
+            </w:pPr>
+            <w:r>
+              <w:rPr>
+                <w:rFonts w:ascii="Consolas" w:hAnsi="Consolas"/>
+                <w:color w:val="0000FF"/>
+                <w:sz w:val="19"/>
+              </w:rPr>
+              <w:t xml:space="preserve">      </w:t>
+            </w:r>
+            <w:r>
+              <w:rPr>
+                <w:rFonts w:ascii="Consolas" w:hAnsi="Consolas"/>
+                <w:color w:val="0000FF"/>
+                <w:sz w:val="19"/>
+              </w:rPr>
+              <w:t>&lt;</w:t>
+            </w:r>
+            <w:r>
+              <w:rPr>
+                <w:rFonts w:ascii="Consolas" w:hAnsi="Consolas"/>
+                <w:color w:val="A31515"/>
+                <w:sz w:val="19"/>
+              </w:rPr>
+              <w:t>add</w:t>
+            </w:r>
+            <w:r>
+              <w:rPr>
+                <w:rFonts w:ascii="Consolas" w:hAnsi="Consolas"/>
+                <w:color w:val="0000FF"/>
+                <w:sz w:val="19"/>
+              </w:rPr>
+              <w:t xml:space="preserve"> </w:t>
+            </w:r>
+            <w:r>
+              <w:rPr>
+                <w:rFonts w:ascii="Consolas" w:hAnsi="Consolas"/>
+                <w:color w:val="FF0000"/>
+                <w:sz w:val="19"/>
+              </w:rPr>
+              <w:t>key</w:t>
+            </w:r>
+            <w:r>
+              <w:rPr>
+                <w:rFonts w:ascii="Consolas" w:hAnsi="Consolas"/>
+                <w:color w:val="0000FF"/>
+                <w:sz w:val="19"/>
+              </w:rPr>
+              <w:t>=</w:t>
+            </w:r>
+            <w:r>
+              <w:rPr>
+                <w:rFonts w:ascii="Consolas" w:hAnsi="Consolas"/>
+                <w:color w:val="000000"/>
+                <w:sz w:val="19"/>
+              </w:rPr>
+              <w:t>"</w:t>
+            </w:r>
+            <w:r>
+              <w:rPr>
+                <w:rFonts w:ascii="Consolas" w:hAnsi="Consolas"/>
+                <w:color w:val="0000FF"/>
+                <w:sz w:val="19"/>
+              </w:rPr>
               <w:t>HandleGraphics</w:t>
             </w:r>
             <w:r>
@@ -2806,6 +2922,274 @@
                 <w:sz w:val="19"/>
               </w:rPr>
               <w:t xml:space="preserve"> /&gt;</w:t>
+            </w:r>
+          </w:p>
+          <w:p>
+            <w:pPr>
+              <w:pStyle w:val="Normal"/>
+              <w:rPr/>
+            </w:pPr>
+            <w:r>
+              <w:rPr>
+                <w:rFonts w:ascii="Consolas" w:hAnsi="Consolas"/>
+                <w:color w:val="0000FF"/>
+                <w:sz w:val="19"/>
+              </w:rPr>
+              <w:t xml:space="preserve">      </w:t>
+            </w:r>
+            <w:r>
+              <w:rPr>
+                <w:rFonts w:ascii="Consolas" w:hAnsi="Consolas"/>
+                <w:color w:val="0000FF"/>
+                <w:sz w:val="19"/>
+              </w:rPr>
+              <w:t>&lt;</w:t>
+            </w:r>
+            <w:r>
+              <w:rPr>
+                <w:rFonts w:ascii="Consolas" w:hAnsi="Consolas"/>
+                <w:color w:val="A31515"/>
+                <w:sz w:val="19"/>
+              </w:rPr>
+              <w:t>add</w:t>
+            </w:r>
+            <w:r>
+              <w:rPr>
+                <w:rFonts w:ascii="Consolas" w:hAnsi="Consolas"/>
+                <w:color w:val="0000FF"/>
+                <w:sz w:val="19"/>
+              </w:rPr>
+              <w:t xml:space="preserve"> </w:t>
+            </w:r>
+            <w:r>
+              <w:rPr>
+                <w:rFonts w:ascii="Consolas" w:hAnsi="Consolas"/>
+                <w:color w:val="FF0000"/>
+                <w:sz w:val="19"/>
+              </w:rPr>
+              <w:t>key</w:t>
+            </w:r>
+            <w:r>
+              <w:rPr>
+                <w:rFonts w:ascii="Consolas" w:hAnsi="Consolas"/>
+                <w:color w:val="0000FF"/>
+                <w:sz w:val="19"/>
+              </w:rPr>
+              <w:t>=</w:t>
+            </w:r>
+            <w:r>
+              <w:rPr>
+                <w:rFonts w:ascii="Consolas" w:hAnsi="Consolas"/>
+                <w:color w:val="000000"/>
+                <w:sz w:val="19"/>
+              </w:rPr>
+              <w:t>"</w:t>
+            </w:r>
+            <w:r>
+              <w:rPr>
+                <w:rFonts w:ascii="Consolas" w:hAnsi="Consolas"/>
+                <w:color w:val="0000FF"/>
+                <w:sz w:val="19"/>
+              </w:rPr>
+              <w:t>DecoderDeveloperMode</w:t>
+            </w:r>
+            <w:r>
+              <w:rPr>
+                <w:rFonts w:ascii="Consolas" w:hAnsi="Consolas"/>
+                <w:color w:val="000000"/>
+                <w:sz w:val="19"/>
+              </w:rPr>
+              <w:t>"</w:t>
+            </w:r>
+            <w:r>
+              <w:rPr>
+                <w:rFonts w:ascii="Consolas" w:hAnsi="Consolas"/>
+                <w:color w:val="0000FF"/>
+                <w:sz w:val="19"/>
+              </w:rPr>
+              <w:t xml:space="preserve"> </w:t>
+            </w:r>
+            <w:r>
+              <w:rPr>
+                <w:rFonts w:ascii="Consolas" w:hAnsi="Consolas"/>
+                <w:color w:val="FF0000"/>
+                <w:sz w:val="19"/>
+              </w:rPr>
+              <w:t>value</w:t>
+            </w:r>
+            <w:r>
+              <w:rPr>
+                <w:rFonts w:ascii="Consolas" w:hAnsi="Consolas"/>
+                <w:color w:val="0000FF"/>
+                <w:sz w:val="19"/>
+              </w:rPr>
+              <w:t>=</w:t>
+            </w:r>
+            <w:r>
+              <w:rPr>
+                <w:rFonts w:ascii="Consolas" w:hAnsi="Consolas"/>
+                <w:color w:val="000000"/>
+                <w:sz w:val="19"/>
+              </w:rPr>
+              <w:t>"</w:t>
+            </w:r>
+            <w:r>
+              <w:rPr>
+                <w:rFonts w:ascii="Consolas" w:hAnsi="Consolas"/>
+                <w:color w:val="0000FF"/>
+                <w:sz w:val="19"/>
+              </w:rPr>
+              <w:t>no</w:t>
+            </w:r>
+            <w:r>
+              <w:rPr>
+                <w:rFonts w:ascii="Consolas" w:hAnsi="Consolas"/>
+                <w:color w:val="000000"/>
+                <w:sz w:val="19"/>
+              </w:rPr>
+              <w:t>"</w:t>
+            </w:r>
+            <w:r>
+              <w:rPr>
+                <w:rFonts w:ascii="Consolas" w:hAnsi="Consolas"/>
+                <w:color w:val="0000FF"/>
+                <w:sz w:val="19"/>
+              </w:rPr>
+              <w:t xml:space="preserve"> /&gt; </w:t>
+            </w:r>
+          </w:p>
+          <w:p>
+            <w:pPr>
+              <w:pStyle w:val="Normal"/>
+              <w:rPr/>
+            </w:pPr>
+            <w:r>
+              <w:rPr>
+                <w:rFonts w:ascii="Consolas" w:hAnsi="Consolas"/>
+                <w:color w:val="0000FF"/>
+                <w:sz w:val="19"/>
+              </w:rPr>
+              <w:t xml:space="preserve">      </w:t>
+            </w:r>
+            <w:r>
+              <w:rPr>
+                <w:rFonts w:ascii="Consolas" w:hAnsi="Consolas"/>
+                <w:color w:val="0000FF"/>
+                <w:sz w:val="19"/>
+              </w:rPr>
+              <w:t>&lt;</w:t>
+            </w:r>
+            <w:r>
+              <w:rPr>
+                <w:rFonts w:ascii="Consolas" w:hAnsi="Consolas"/>
+                <w:color w:val="A31515"/>
+                <w:sz w:val="19"/>
+              </w:rPr>
+              <w:t>add</w:t>
+            </w:r>
+            <w:r>
+              <w:rPr>
+                <w:rFonts w:ascii="Consolas" w:hAnsi="Consolas"/>
+                <w:color w:val="0000FF"/>
+                <w:sz w:val="19"/>
+              </w:rPr>
+              <w:t xml:space="preserve"> </w:t>
+            </w:r>
+            <w:r>
+              <w:rPr>
+                <w:rFonts w:ascii="Consolas" w:hAnsi="Consolas"/>
+                <w:color w:val="FF0000"/>
+                <w:sz w:val="19"/>
+              </w:rPr>
+              <w:t>key</w:t>
+            </w:r>
+            <w:r>
+              <w:rPr>
+                <w:rFonts w:ascii="Consolas" w:hAnsi="Consolas"/>
+                <w:color w:val="0000FF"/>
+                <w:sz w:val="19"/>
+              </w:rPr>
+              <w:t>=</w:t>
+            </w:r>
+            <w:r>
+              <w:rPr>
+                <w:rFonts w:ascii="Consolas" w:hAnsi="Consolas"/>
+                <w:color w:val="000000"/>
+                <w:sz w:val="19"/>
+              </w:rPr>
+              <w:t>"</w:t>
+            </w:r>
+            <w:r>
+              <w:rPr>
+                <w:rFonts w:ascii="Consolas" w:hAnsi="Consolas"/>
+                <w:color w:val="0000FF"/>
+                <w:sz w:val="19"/>
+              </w:rPr>
+              <w:t>UseExternal7Zip</w:t>
+            </w:r>
+            <w:r>
+              <w:rPr>
+                <w:rFonts w:ascii="Consolas" w:hAnsi="Consolas"/>
+                <w:color w:val="000000"/>
+                <w:sz w:val="19"/>
+              </w:rPr>
+              <w:t>"</w:t>
+            </w:r>
+            <w:r>
+              <w:rPr>
+                <w:rFonts w:ascii="Consolas" w:hAnsi="Consolas"/>
+                <w:color w:val="0000FF"/>
+                <w:sz w:val="19"/>
+              </w:rPr>
+              <w:t xml:space="preserve"> </w:t>
+            </w:r>
+            <w:r>
+              <w:rPr>
+                <w:rFonts w:ascii="Consolas" w:hAnsi="Consolas"/>
+                <w:color w:val="FF0000"/>
+                <w:sz w:val="19"/>
+              </w:rPr>
+              <w:t>value</w:t>
+            </w:r>
+            <w:r>
+              <w:rPr>
+                <w:rFonts w:ascii="Consolas" w:hAnsi="Consolas"/>
+                <w:color w:val="0000FF"/>
+                <w:sz w:val="19"/>
+              </w:rPr>
+              <w:t>=</w:t>
+            </w:r>
+            <w:r>
+              <w:rPr>
+                <w:rFonts w:ascii="Consolas" w:hAnsi="Consolas"/>
+                <w:color w:val="000000"/>
+                <w:sz w:val="19"/>
+              </w:rPr>
+              <w:t>"</w:t>
+            </w:r>
+            <w:r>
+              <w:rPr>
+                <w:rFonts w:ascii="Consolas" w:hAnsi="Consolas"/>
+                <w:color w:val="0000FF"/>
+                <w:sz w:val="19"/>
+              </w:rPr>
+              <w:t>no</w:t>
+            </w:r>
+            <w:r>
+              <w:rPr>
+                <w:rFonts w:ascii="Consolas" w:hAnsi="Consolas"/>
+                <w:color w:val="000000"/>
+                <w:sz w:val="19"/>
+              </w:rPr>
+              <w:t>"</w:t>
+            </w:r>
+            <w:r>
+              <w:rPr>
+                <w:rFonts w:ascii="Consolas" w:hAnsi="Consolas"/>
+                <w:color w:val="0000FF"/>
+                <w:sz w:val="19"/>
+              </w:rPr>
+              <w:t xml:space="preserve"> /&gt; </w:t>
             </w:r>
           </w:p>
           <w:p>
@@ -2813,92 +3197,40 @@
               <w:pStyle w:val="Normal"/>
               <w:jc w:val="left"/>
               <w:rPr>
-                <w:rFonts w:ascii="Liberation Serif" w:hAnsi="Liberation Serif"/>
-                <w:b w:val="false"/>
-                <w:b w:val="false"/>
-                <w:bCs w:val="false"/>
-                <w:i w:val="false"/>
-                <w:i w:val="false"/>
-                <w:iCs w:val="false"/>
-                <w:strike w:val="false"/>
-                <w:dstrike w:val="false"/>
-                <w:outline w:val="false"/>
-                <w:shadow w:val="false"/>
-                <w:color w:val="000000"/>
-                <w:sz w:val="24"/>
-                <w:szCs w:val="24"/>
-                <w:u w:val="none"/>
+                <w:rFonts w:ascii="Consolas" w:hAnsi="Consolas"/>
+                <w:color w:val="0000FF"/>
+                <w:sz w:val="19"/>
               </w:rPr>
             </w:pPr>
             <w:r>
               <w:rPr>
                 <w:rFonts w:ascii="Consolas" w:hAnsi="Consolas"/>
-                <w:b w:val="false"/>
-                <w:bCs w:val="false"/>
-                <w:i w:val="false"/>
-                <w:iCs w:val="false"/>
-                <w:strike w:val="false"/>
-                <w:dstrike w:val="false"/>
-                <w:outline w:val="false"/>
-                <w:shadow w:val="false"/>
                 <w:color w:val="0000FF"/>
                 <w:sz w:val="19"/>
-                <w:szCs w:val="24"/>
-                <w:u w:val="none"/>
               </w:rPr>
               <w:t xml:space="preserve">    </w:t>
             </w:r>
             <w:r>
               <w:rPr>
                 <w:rFonts w:ascii="Consolas" w:hAnsi="Consolas"/>
-                <w:b w:val="false"/>
-                <w:bCs w:val="false"/>
-                <w:i w:val="false"/>
-                <w:iCs w:val="false"/>
-                <w:strike w:val="false"/>
-                <w:dstrike w:val="false"/>
-                <w:outline w:val="false"/>
-                <w:shadow w:val="false"/>
                 <w:color w:val="0000FF"/>
                 <w:sz w:val="19"/>
-                <w:szCs w:val="24"/>
-                <w:u w:val="none"/>
               </w:rPr>
               <w:t>&lt;/</w:t>
             </w:r>
             <w:r>
               <w:rPr>
                 <w:rFonts w:ascii="Consolas" w:hAnsi="Consolas"/>
-                <w:b w:val="false"/>
-                <w:bCs w:val="false"/>
-                <w:i w:val="false"/>
-                <w:iCs w:val="false"/>
-                <w:strike w:val="false"/>
-                <w:dstrike w:val="false"/>
-                <w:outline w:val="false"/>
-                <w:shadow w:val="false"/>
                 <w:color w:val="A31515"/>
                 <w:sz w:val="19"/>
-                <w:szCs w:val="24"/>
-                <w:u w:val="none"/>
               </w:rPr>
               <w:t>appSettings</w:t>
             </w:r>
             <w:r>
               <w:rPr>
                 <w:rFonts w:ascii="Consolas" w:hAnsi="Consolas"/>
-                <w:b w:val="false"/>
-                <w:bCs w:val="false"/>
-                <w:i w:val="false"/>
-                <w:iCs w:val="false"/>
-                <w:strike w:val="false"/>
-                <w:dstrike w:val="false"/>
-                <w:outline w:val="false"/>
-                <w:shadow w:val="false"/>
                 <w:color w:val="0000FF"/>
                 <w:sz w:val="19"/>
-                <w:szCs w:val="24"/>
-                <w:u w:val="none"/>
               </w:rPr>
               <w:t>&gt;</w:t>
             </w:r>
@@ -7435,7 +7767,6 @@
         </w:tabs>
         <w:ind w:left="1440" w:hanging="360"/>
       </w:pPr>
-      <w:rPr/>
     </w:lvl>
     <w:lvl w:ilvl="1">
       <w:start w:val="1"/>
@@ -7448,7 +7779,6 @@
         </w:tabs>
         <w:ind w:left="1800" w:hanging="360"/>
       </w:pPr>
-      <w:rPr/>
     </w:lvl>
     <w:lvl w:ilvl="2">
       <w:start w:val="1"/>
@@ -7461,7 +7791,6 @@
         </w:tabs>
         <w:ind w:left="2160" w:hanging="360"/>
       </w:pPr>
-      <w:rPr/>
     </w:lvl>
     <w:lvl w:ilvl="3">
       <w:start w:val="1"/>
@@ -7474,7 +7803,6 @@
         </w:tabs>
         <w:ind w:left="2520" w:hanging="360"/>
       </w:pPr>
-      <w:rPr/>
     </w:lvl>
     <w:lvl w:ilvl="4">
       <w:start w:val="1"/>
@@ -7487,7 +7815,6 @@
         </w:tabs>
         <w:ind w:left="2880" w:hanging="360"/>
       </w:pPr>
-      <w:rPr/>
     </w:lvl>
     <w:lvl w:ilvl="5">
       <w:start w:val="1"/>
@@ -7500,7 +7827,6 @@
         </w:tabs>
         <w:ind w:left="3240" w:hanging="360"/>
       </w:pPr>
-      <w:rPr/>
     </w:lvl>
     <w:lvl w:ilvl="6">
       <w:start w:val="1"/>
@@ -7513,7 +7839,6 @@
         </w:tabs>
         <w:ind w:left="3600" w:hanging="360"/>
       </w:pPr>
-      <w:rPr/>
     </w:lvl>
     <w:lvl w:ilvl="7">
       <w:start w:val="1"/>
@@ -7526,7 +7851,6 @@
         </w:tabs>
         <w:ind w:left="3960" w:hanging="360"/>
       </w:pPr>
-      <w:rPr/>
     </w:lvl>
     <w:lvl w:ilvl="8">
       <w:start w:val="1"/>
@@ -7539,7 +7863,6 @@
         </w:tabs>
         <w:ind w:left="4320" w:hanging="360"/>
       </w:pPr>
-      <w:rPr/>
     </w:lvl>
   </w:abstractNum>
   <w:num w:numId="1">

</xml_diff>

<commit_message>
Update the document about generation of releases
</commit_message>
<xml_diff>
--- a/Documentation/Generering af release 5.0.0.0.docx
+++ b/Documentation/Generering af release 5.0.0.0.docx
@@ -1324,15 +1324,15 @@
         </w:tblCellMar>
       </w:tblPr>
       <w:tblGrid>
-        <w:gridCol w:w="1000"/>
+        <w:gridCol w:w="999"/>
         <w:gridCol w:w="1813"/>
-        <w:gridCol w:w="6487"/>
+        <w:gridCol w:w="6488"/>
       </w:tblGrid>
       <w:tr>
         <w:trPr/>
         <w:tc>
           <w:tcPr>
-            <w:tcW w:w="1000" w:type="dxa"/>
+            <w:tcW w:w="999" w:type="dxa"/>
             <w:tcBorders>
               <w:top w:val="single" w:sz="4" w:space="0" w:color="000000"/>
               <w:left w:val="single" w:sz="4" w:space="0" w:color="000000"/>
@@ -1392,7 +1392,7 @@
         </w:tc>
         <w:tc>
           <w:tcPr>
-            <w:tcW w:w="6487" w:type="dxa"/>
+            <w:tcW w:w="6488" w:type="dxa"/>
             <w:tcBorders>
               <w:top w:val="single" w:sz="4" w:space="0" w:color="000000"/>
               <w:left w:val="single" w:sz="4" w:space="0" w:color="000000"/>
@@ -1426,7 +1426,7 @@
         <w:trPr/>
         <w:tc>
           <w:tcPr>
-            <w:tcW w:w="1000" w:type="dxa"/>
+            <w:tcW w:w="999" w:type="dxa"/>
             <w:tcBorders>
               <w:top w:val="single" w:sz="4" w:space="0" w:color="000000"/>
               <w:left w:val="single" w:sz="4" w:space="0" w:color="000000"/>
@@ -1486,7 +1486,7 @@
         </w:tc>
         <w:tc>
           <w:tcPr>
-            <w:tcW w:w="6487" w:type="dxa"/>
+            <w:tcW w:w="6488" w:type="dxa"/>
             <w:tcBorders>
               <w:top w:val="single" w:sz="4" w:space="0" w:color="000000"/>
               <w:left w:val="single" w:sz="4" w:space="0" w:color="000000"/>
@@ -1517,7 +1517,7 @@
         <w:trPr/>
         <w:tc>
           <w:tcPr>
-            <w:tcW w:w="1000" w:type="dxa"/>
+            <w:tcW w:w="999" w:type="dxa"/>
             <w:tcBorders>
               <w:top w:val="single" w:sz="4" w:space="0" w:color="000000"/>
               <w:left w:val="single" w:sz="4" w:space="0" w:color="000000"/>
@@ -1574,7 +1574,7 @@
         </w:tc>
         <w:tc>
           <w:tcPr>
-            <w:tcW w:w="6487" w:type="dxa"/>
+            <w:tcW w:w="6488" w:type="dxa"/>
             <w:tcBorders>
               <w:top w:val="single" w:sz="4" w:space="0" w:color="000000"/>
               <w:left w:val="single" w:sz="4" w:space="0" w:color="000000"/>
@@ -1605,7 +1605,7 @@
         <w:trPr/>
         <w:tc>
           <w:tcPr>
-            <w:tcW w:w="1000" w:type="dxa"/>
+            <w:tcW w:w="999" w:type="dxa"/>
             <w:tcBorders>
               <w:left w:val="single" w:sz="4" w:space="0" w:color="000000"/>
               <w:bottom w:val="single" w:sz="4" w:space="0" w:color="000000"/>
@@ -1659,7 +1659,7 @@
         </w:tc>
         <w:tc>
           <w:tcPr>
-            <w:tcW w:w="6487" w:type="dxa"/>
+            <w:tcW w:w="6488" w:type="dxa"/>
             <w:tcBorders>
               <w:left w:val="single" w:sz="4" w:space="0" w:color="000000"/>
               <w:bottom w:val="single" w:sz="4" w:space="0" w:color="000000"/>
@@ -3556,15 +3556,31 @@
         <w:pStyle w:val="Standard"/>
         <w:bidi w:val="0"/>
         <w:jc w:val="left"/>
-        <w:rPr>
-          <w:rFonts w:ascii="Arial" w:hAnsi="Arial" w:cs="Arial"/>
-        </w:rPr>
-      </w:pPr>
-      <w:r>
-        <w:rPr>
-          <w:rFonts w:cs="Arial" w:ascii="Arial" w:hAnsi="Arial"/>
-        </w:rPr>
-        <w:t>Vær uindervejs omhyggelig med at få ”IBO” med alle 3 steder</w:t>
+        <w:rPr/>
+      </w:pPr>
+      <w:r>
+        <w:rPr>
+          <w:rFonts w:cs="Arial" w:ascii="Arial" w:hAnsi="Arial"/>
+        </w:rPr>
+        <w:t>Vær uindervejs omhyggelig med at få ”IBO</w:t>
+      </w:r>
+      <w:r>
+        <w:rPr>
+          <w:rFonts w:cs="Arial" w:ascii="Arial" w:hAnsi="Arial"/>
+        </w:rPr>
+        <w:t>S</w:t>
+      </w:r>
+      <w:r>
+        <w:rPr>
+          <w:rFonts w:cs="Arial" w:ascii="Arial" w:hAnsi="Arial"/>
+        </w:rPr>
+        <w:t xml:space="preserve">” med alle 3 steder: </w:t>
+      </w:r>
+      <w:r>
+        <w:rPr>
+          <w:rFonts w:cs="Arial" w:ascii="Arial" w:hAnsi="Arial"/>
+        </w:rPr>
+        <w:t>Det skal manuelt tilføjes til feltet ”Product Name” i den store oversigtsdialog, hvor man kan trykke på den grønne knap.</w:t>
       </w:r>
     </w:p>
     <w:p>
@@ -3685,13 +3701,6 @@
           <w:rFonts w:cs="Arial" w:ascii="Arial" w:hAnsi="Arial"/>
         </w:rPr>
         <w:t>Main Executable = "IBOS MusicXmlReader</w:t>
-      </w:r>
-      <w:r>
-        <w:rPr>
-          <w:rFonts w:cs="Arial" w:ascii="Arial" w:hAnsi="Arial"/>
-          <w:lang w:val="en-US"/>
-        </w:rPr>
-        <w:t xml:space="preserve"> 5.0.0.0</w:t>
       </w:r>
       <w:r>
         <w:rPr>

</xml_diff>